<commit_message>
docs: update Claude-VAI.docx with token validation fixes, developer onboarding, and IAM role additions
Reflects all changes from the dev VM testing session: ya29.* prefix
check in token classification, IAM API fallback for GCE metadata
tokens, roles/iam.serviceAccountViewer on gateway SAs, PGA enablement,
dashboard invoker grant, and a new Section 12 (Developer Onboarding)
covering admin and developer workflows.
</commit_message>
<xml_diff>
--- a/Claude-VAI.docx
+++ b/Claude-VAI.docx
@@ -185,7 +185,15 @@
         <w:rPr>
           <w:sz w:val="22"/>
         </w:rPr>
-        <w:t xml:space="preserve">  12.  Validation and Regression Testing</w:t>
+        <w:t xml:space="preserve">  12.  Developer Onboarding</w:t>
+      </w:r>
+    </w:p>
+    <w:p>
+      <w:r>
+        <w:rPr>
+          <w:sz w:val="22"/>
+        </w:rPr>
+        <w:t xml:space="preserve">  13.  Validation and Regression Testing</w:t>
       </w:r>
     </w:p>
     <w:p>
@@ -2343,7 +2351,7 @@
     </w:p>
     <w:p>
       <w:r>
-        <w:t>Two project-level roles are granted to the service account:</w:t>
+        <w:t>Three project-level roles are granted to the service account:</w:t>
       </w:r>
     </w:p>
     <w:tbl>
@@ -2461,11 +2469,46 @@
           </w:p>
         </w:tc>
       </w:tr>
+      <w:tr>
+        <w:tc>
+          <w:tcPr>
+            <w:tcW w:type="dxa" w:w="4320"/>
+          </w:tcPr>
+          <w:p>
+            <w:r/>
+            <w:r>
+              <w:rPr>
+                <w:sz w:val="18"/>
+              </w:rPr>
+              <w:t>roles/iam.serviceAccountViewer</w:t>
+            </w:r>
+          </w:p>
+        </w:tc>
+        <w:tc>
+          <w:tcPr>
+            <w:tcW w:type="dxa" w:w="4320"/>
+          </w:tcPr>
+          <w:p>
+            <w:r/>
+            <w:r>
+              <w:rPr>
+                <w:sz w:val="18"/>
+              </w:rPr>
+              <w:t>Resolve GCE service account emails from numeric IDs (needed for dev VM token validation)</w:t>
+            </w:r>
+          </w:p>
+        </w:tc>
+      </w:tr>
     </w:tbl>
     <w:p/>
     <w:p>
       <w:r>
         <w:t>This service account — not the developer — authenticates to Vertex AI. Developers never receive roles/aiplatform.user directly.</w:t>
+      </w:r>
+    </w:p>
+    <w:p>
+      <w:r>
+        <w:t>The iam.serviceAccountViewer role is required because GCE metadata tokens (used by the dev VM) do not include an email in the tokeninfo response — only a numeric unique ID. The gateway resolves the email via the IAM API so it can match against ALLOWED_PRINCIPALS.</w:t>
       </w:r>
     </w:p>
     <w:p>
@@ -3381,7 +3424,7 @@
               <w:rPr>
                 <w:sz w:val="18"/>
               </w:rPr>
-              <w:t>aiplatform.user + logging.logWriter</w:t>
+              <w:t>aiplatform.user + logging.logWriter + iam.serviceAccountViewer</w:t>
             </w:r>
           </w:p>
         </w:tc>
@@ -3396,7 +3439,7 @@
               <w:rPr>
                 <w:sz w:val="18"/>
               </w:rPr>
-              <w:t>logging.logWriter only</w:t>
+              <w:t>logging.logWriter + iam.serviceAccountViewer</w:t>
             </w:r>
           </w:p>
         </w:tc>
@@ -4663,7 +4706,82 @@
           <w:color w:val="333333"/>
           <w:sz w:val="18"/>
         </w:rPr>
-        <w:t xml:space="preserve">  |-- Token looks like a JWT (3 dot-separated parts)?</w:t>
+        <w:t xml:space="preserve">  |-- Classify token type:</w:t>
+      </w:r>
+    </w:p>
+    <w:p>
+      <w:pPr>
+        <w:spacing w:before="0" w:after="0"/>
+        <w:ind w:left="850"/>
+        <w:jc w:val="left"/>
+      </w:pPr>
+      <w:r>
+        <w:rPr>
+          <w:rFonts w:ascii="Consolas" w:hAnsi="Consolas"/>
+          <w:color w:val="333333"/>
+          <w:sz w:val="18"/>
+        </w:rPr>
+        <w:t xml:space="preserve">  |     |-- Starts with "ya29."? --&gt; access token (skip JWT path)</w:t>
+      </w:r>
+    </w:p>
+    <w:p>
+      <w:pPr>
+        <w:spacing w:before="0" w:after="0"/>
+        <w:ind w:left="850"/>
+        <w:jc w:val="left"/>
+      </w:pPr>
+      <w:r>
+        <w:rPr>
+          <w:rFonts w:ascii="Consolas" w:hAnsi="Consolas"/>
+          <w:color w:val="333333"/>
+          <w:sz w:val="18"/>
+        </w:rPr>
+        <w:t xml:space="preserve">  |     |-- 3 dot-separated parts, header &gt;= 20 chars? --&gt; JWT</w:t>
+      </w:r>
+    </w:p>
+    <w:p>
+      <w:pPr>
+        <w:spacing w:before="0" w:after="0"/>
+        <w:ind w:left="850"/>
+        <w:jc w:val="left"/>
+      </w:pPr>
+      <w:r>
+        <w:rPr>
+          <w:rFonts w:ascii="Consolas" w:hAnsi="Consolas"/>
+          <w:color w:val="333333"/>
+          <w:sz w:val="18"/>
+        </w:rPr>
+        <w:t xml:space="preserve">  |     +-- Otherwise --&gt; access token</w:t>
+      </w:r>
+    </w:p>
+    <w:p>
+      <w:pPr>
+        <w:spacing w:before="0" w:after="0"/>
+        <w:ind w:left="850"/>
+        <w:jc w:val="left"/>
+      </w:pPr>
+      <w:r>
+        <w:rPr>
+          <w:rFonts w:ascii="Consolas" w:hAnsi="Consolas"/>
+          <w:color w:val="333333"/>
+          <w:sz w:val="18"/>
+        </w:rPr>
+        <w:t xml:space="preserve">  |</w:t>
+      </w:r>
+    </w:p>
+    <w:p>
+      <w:pPr>
+        <w:spacing w:before="0" w:after="0"/>
+        <w:ind w:left="850"/>
+        <w:jc w:val="left"/>
+      </w:pPr>
+      <w:r>
+        <w:rPr>
+          <w:rFonts w:ascii="Consolas" w:hAnsi="Consolas"/>
+          <w:color w:val="333333"/>
+          <w:sz w:val="18"/>
+        </w:rPr>
+        <w:t xml:space="preserve">  |-- JWT path:</w:t>
       </w:r>
     </w:p>
     <w:p>
@@ -4708,7 +4826,7 @@
           <w:color w:val="333333"/>
           <w:sz w:val="18"/>
         </w:rPr>
-        <w:t xml:space="preserve">  |</w:t>
+        <w:t xml:space="preserve">  |         Extract email from claims</w:t>
       </w:r>
     </w:p>
     <w:p>
@@ -4723,7 +4841,22 @@
           <w:color w:val="333333"/>
           <w:sz w:val="18"/>
         </w:rPr>
-        <w:t xml:space="preserve">  |-- Token is an access token (not JWT)?</w:t>
+        <w:t xml:space="preserve">  |</w:t>
+      </w:r>
+    </w:p>
+    <w:p>
+      <w:pPr>
+        <w:spacing w:before="0" w:after="0"/>
+        <w:ind w:left="850"/>
+        <w:jc w:val="left"/>
+      </w:pPr>
+      <w:r>
+        <w:rPr>
+          <w:rFonts w:ascii="Consolas" w:hAnsi="Consolas"/>
+          <w:color w:val="333333"/>
+          <w:sz w:val="18"/>
+        </w:rPr>
+        <w:t xml:space="preserve">  |-- Access token path:</w:t>
       </w:r>
     </w:p>
     <w:p>
@@ -4783,7 +4916,67 @@
           <w:color w:val="333333"/>
           <w:sz w:val="18"/>
         </w:rPr>
-        <w:t xml:space="preserve">  |             Parse email from response, cache result</w:t>
+        <w:t xml:space="preserve">  |             |-- email in response? --&gt; use it, cache result</w:t>
+      </w:r>
+    </w:p>
+    <w:p>
+      <w:pPr>
+        <w:spacing w:before="0" w:after="0"/>
+        <w:ind w:left="850"/>
+        <w:jc w:val="left"/>
+      </w:pPr>
+      <w:r>
+        <w:rPr>
+          <w:rFonts w:ascii="Consolas" w:hAnsi="Consolas"/>
+          <w:color w:val="333333"/>
+          <w:sz w:val="18"/>
+        </w:rPr>
+        <w:t xml:space="preserve">  |             +-- No email (GCE metadata token)?</w:t>
+      </w:r>
+    </w:p>
+    <w:p>
+      <w:pPr>
+        <w:spacing w:before="0" w:after="0"/>
+        <w:ind w:left="850"/>
+        <w:jc w:val="left"/>
+      </w:pPr>
+      <w:r>
+        <w:rPr>
+          <w:rFonts w:ascii="Consolas" w:hAnsi="Consolas"/>
+          <w:color w:val="333333"/>
+          <w:sz w:val="18"/>
+        </w:rPr>
+        <w:t xml:space="preserve">  |                   Resolve via IAM API: GET /v1/projects/-/serviceAccounts/{azp}</w:t>
+      </w:r>
+    </w:p>
+    <w:p>
+      <w:pPr>
+        <w:spacing w:before="0" w:after="0"/>
+        <w:ind w:left="850"/>
+        <w:jc w:val="left"/>
+      </w:pPr>
+      <w:r>
+        <w:rPr>
+          <w:rFonts w:ascii="Consolas" w:hAnsi="Consolas"/>
+          <w:color w:val="333333"/>
+          <w:sz w:val="18"/>
+        </w:rPr>
+        <w:t xml:space="preserve">  |                   (azp = numeric SA unique ID from tokeninfo)</w:t>
+      </w:r>
+    </w:p>
+    <w:p>
+      <w:pPr>
+        <w:spacing w:before="0" w:after="0"/>
+        <w:ind w:left="850"/>
+        <w:jc w:val="left"/>
+      </w:pPr>
+      <w:r>
+        <w:rPr>
+          <w:rFonts w:ascii="Consolas" w:hAnsi="Consolas"/>
+          <w:color w:val="333333"/>
+          <w:sz w:val="18"/>
+        </w:rPr>
+        <w:t xml:space="preserve">  |                   Cache resolved email (256 entries, 1-hour TTL)</w:t>
       </w:r>
     </w:p>
     <w:p>
@@ -4813,7 +5006,7 @@
           <w:color w:val="333333"/>
           <w:sz w:val="18"/>
         </w:rPr>
-        <w:t xml:space="preserve">  |-- Verification failed?</w:t>
+        <w:t xml:space="preserve">  |-- Verification failed (no email resolved)?</w:t>
       </w:r>
     </w:p>
     <w:p>
@@ -4919,6 +5112,17 @@
           <w:sz w:val="18"/>
         </w:rPr>
         <w:t xml:space="preserve">      Pass to next handler</w:t>
+      </w:r>
+    </w:p>
+    <w:p/>
+    <w:p>
+      <w:r>
+        <w:t>The ya29.* prefix check is critical: GCE metadata tokens (ya29.c.*) have three dot-separated parts, which would otherwise pass the JWT heuristic and be sent to OIDC verification, where they always fail. The prefix check short-circuits this misclassification.</w:t>
+      </w:r>
+    </w:p>
+    <w:p>
+      <w:r>
+        <w:t>The IAM API fallback exists because GCE metadata tokens return only a numeric azp (authorized party) in the tokeninfo response, not an email. The gateway calls IAM to resolve the service account email, which is then matched against ALLOWED_PRINCIPALS. Results are cached for 1 hour to avoid per-request IAM API calls. This path requires roles/iam.serviceAccountViewer on the gateway SA.</w:t>
       </w:r>
     </w:p>
     <w:p>
@@ -7770,6 +7974,11 @@
     <w:p>
       <w:r>
         <w:t>No GLB needed. Cloud Run uses --ingress internal. Developers SSH into the dev VM via IAP TCP tunneling and run Claude Code directly from the VM. The dev VM is pre-configured with Claude Code, ADC credentials, and gateway URLs pointing at the internal Cloud Run services.</w:t>
+      </w:r>
+    </w:p>
+    <w:p>
+      <w:r>
+        <w:t>deploy-dev-vm.sh handles two critical networking prerequisites automatically: (1) enabling Private Google Access on the default subnet (required for the no-public-IP VM to reach Cloud Run *.run.app endpoints), and (2) granting roles/run.invoker on the admin dashboard to the VM's service account (so developers can view the dashboard from the VM).</w:t>
       </w:r>
     </w:p>
     <w:p>
@@ -8340,7 +8549,12 @@
         <w:pStyle w:val="Heading1"/>
       </w:pPr>
       <w:r>
-        <w:t>12. Validation and Regression Testing</w:t>
+        <w:t>12. Developer Onboarding</w:t>
+      </w:r>
+    </w:p>
+    <w:p>
+      <w:r>
+        <w:t>This section covers the two workflows needed to get a new developer productive: the admin steps to grant access, and the developer steps to connect.</w:t>
       </w:r>
     </w:p>
     <w:p>
@@ -8348,7 +8562,567 @@
         <w:pStyle w:val="Heading2"/>
       </w:pPr>
       <w:r>
-        <w:t>12.1 Pre-Deploy Checks: pre-deploy-check.sh</w:t>
+        <w:t>12.1 Admin: Onboarding a New Developer</w:t>
+      </w:r>
+    </w:p>
+    <w:p>
+      <w:r>
+        <w:t>An admin (project owner/editor) performs these steps to grant a new developer access to the deployment:</w:t>
+      </w:r>
+    </w:p>
+    <w:p>
+      <w:r>
+        <w:rPr>
+          <w:b/>
+        </w:rPr>
+        <w:t xml:space="preserve">Step 1 — Add the developer to ALLOWED_PRINCIPALS. </w:t>
+      </w:r>
+      <w:r>
+        <w:t>Update config.yaml (or the Terraform allowed_principals variable) to include the developer's identity, then re-deploy the gateways so the ALLOWED_PRINCIPALS environment variable is updated.</w:t>
+      </w:r>
+    </w:p>
+    <w:p>
+      <w:pPr>
+        <w:spacing w:before="0" w:after="0"/>
+        <w:ind w:left="567"/>
+        <w:shd w:fill="F5F5F5" w:val="clear"/>
+      </w:pPr>
+      <w:r>
+        <w:rPr>
+          <w:rFonts w:ascii="Consolas" w:hAnsi="Consolas"/>
+          <w:color w:val="1A1A2E"/>
+          <w:sz w:val="17"/>
+        </w:rPr>
+        <w:t># Re-deploy gateways with updated principals</w:t>
+      </w:r>
+    </w:p>
+    <w:p>
+      <w:pPr>
+        <w:spacing w:before="0" w:after="0"/>
+        <w:ind w:left="567"/>
+        <w:shd w:fill="F5F5F5" w:val="clear"/>
+      </w:pPr>
+      <w:r>
+        <w:rPr>
+          <w:rFonts w:ascii="Consolas" w:hAnsi="Consolas"/>
+          <w:color w:val="1A1A2E"/>
+          <w:sz w:val="17"/>
+        </w:rPr>
+        <w:t>cd scripts &amp;&amp; ./deploy.sh</w:t>
+      </w:r>
+    </w:p>
+    <w:p/>
+    <w:p>
+      <w:r>
+        <w:rPr>
+          <w:b/>
+        </w:rPr>
+        <w:t xml:space="preserve">Step 2 — Grant IAP tunnel and OS Login roles (dev VM access). </w:t>
+      </w:r>
+      <w:r>
+        <w:t>If the developer will access the dev VM, grant two IAM roles:</w:t>
+      </w:r>
+    </w:p>
+    <w:p>
+      <w:pPr>
+        <w:spacing w:before="0" w:after="0"/>
+        <w:ind w:left="567"/>
+        <w:shd w:fill="F5F5F5" w:val="clear"/>
+      </w:pPr>
+      <w:r>
+        <w:rPr>
+          <w:rFonts w:ascii="Consolas" w:hAnsi="Consolas"/>
+          <w:color w:val="1A1A2E"/>
+          <w:sz w:val="17"/>
+        </w:rPr>
+        <w:t>gcloud projects add-iam-policy-binding $PROJECT_ID \</w:t>
+      </w:r>
+    </w:p>
+    <w:p>
+      <w:pPr>
+        <w:spacing w:before="0" w:after="0"/>
+        <w:ind w:left="567"/>
+        <w:shd w:fill="F5F5F5" w:val="clear"/>
+      </w:pPr>
+      <w:r>
+        <w:rPr>
+          <w:rFonts w:ascii="Consolas" w:hAnsi="Consolas"/>
+          <w:color w:val="1A1A2E"/>
+          <w:sz w:val="17"/>
+        </w:rPr>
+        <w:t xml:space="preserve">  --member="user:developer@example.com" \</w:t>
+      </w:r>
+    </w:p>
+    <w:p>
+      <w:pPr>
+        <w:spacing w:before="0" w:after="0"/>
+        <w:ind w:left="567"/>
+        <w:shd w:fill="F5F5F5" w:val="clear"/>
+      </w:pPr>
+      <w:r>
+        <w:rPr>
+          <w:rFonts w:ascii="Consolas" w:hAnsi="Consolas"/>
+          <w:color w:val="1A1A2E"/>
+          <w:sz w:val="17"/>
+        </w:rPr>
+        <w:t xml:space="preserve">  --role="roles/iap.tunnelResourceAccessor" --condition=None --quiet</w:t>
+      </w:r>
+    </w:p>
+    <w:p>
+      <w:pPr>
+        <w:spacing w:before="0" w:after="0"/>
+        <w:ind w:left="567"/>
+        <w:shd w:fill="F5F5F5" w:val="clear"/>
+      </w:pPr>
+      <w:r>
+        <w:rPr>
+          <w:rFonts w:ascii="Consolas" w:hAnsi="Consolas"/>
+          <w:color w:val="1A1A2E"/>
+          <w:sz w:val="17"/>
+        </w:rPr>
+      </w:r>
+    </w:p>
+    <w:p>
+      <w:pPr>
+        <w:spacing w:before="0" w:after="0"/>
+        <w:ind w:left="567"/>
+        <w:shd w:fill="F5F5F5" w:val="clear"/>
+      </w:pPr>
+      <w:r>
+        <w:rPr>
+          <w:rFonts w:ascii="Consolas" w:hAnsi="Consolas"/>
+          <w:color w:val="1A1A2E"/>
+          <w:sz w:val="17"/>
+        </w:rPr>
+        <w:t>gcloud projects add-iam-policy-binding $PROJECT_ID \</w:t>
+      </w:r>
+    </w:p>
+    <w:p>
+      <w:pPr>
+        <w:spacing w:before="0" w:after="0"/>
+        <w:ind w:left="567"/>
+        <w:shd w:fill="F5F5F5" w:val="clear"/>
+      </w:pPr>
+      <w:r>
+        <w:rPr>
+          <w:rFonts w:ascii="Consolas" w:hAnsi="Consolas"/>
+          <w:color w:val="1A1A2E"/>
+          <w:sz w:val="17"/>
+        </w:rPr>
+        <w:t xml:space="preserve">  --member="user:developer@example.com" \</w:t>
+      </w:r>
+    </w:p>
+    <w:p>
+      <w:pPr>
+        <w:spacing w:before="0" w:after="0"/>
+        <w:ind w:left="567"/>
+        <w:shd w:fill="F5F5F5" w:val="clear"/>
+      </w:pPr>
+      <w:r>
+        <w:rPr>
+          <w:rFonts w:ascii="Consolas" w:hAnsi="Consolas"/>
+          <w:color w:val="1A1A2E"/>
+          <w:sz w:val="17"/>
+        </w:rPr>
+        <w:t xml:space="preserve">  --role="roles/compute.osLogin" --condition=None --quiet</w:t>
+      </w:r>
+    </w:p>
+    <w:p/>
+    <w:p>
+      <w:r>
+        <w:t>These roles are granted automatically by deploy-dev-vm.sh for identities listed in PRINCIPALS at deploy time. For developers added later, the admin runs the commands above manually.</w:t>
+      </w:r>
+    </w:p>
+    <w:p>
+      <w:r>
+        <w:rPr>
+          <w:b/>
+        </w:rPr>
+        <w:t xml:space="preserve">Step 3 (optional) — Grant dashboard access. </w:t>
+      </w:r>
+      <w:r>
+        <w:t>The admin dashboard uses Cloud Run IAM (roles/run.invoker). Grant it per-service:</w:t>
+      </w:r>
+    </w:p>
+    <w:p>
+      <w:pPr>
+        <w:spacing w:before="0" w:after="0"/>
+        <w:ind w:left="567"/>
+        <w:shd w:fill="F5F5F5" w:val="clear"/>
+      </w:pPr>
+      <w:r>
+        <w:rPr>
+          <w:rFonts w:ascii="Consolas" w:hAnsi="Consolas"/>
+          <w:color w:val="1A1A2E"/>
+          <w:sz w:val="17"/>
+        </w:rPr>
+        <w:t>gcloud run services add-iam-policy-binding admin-dashboard \</w:t>
+      </w:r>
+    </w:p>
+    <w:p>
+      <w:pPr>
+        <w:spacing w:before="0" w:after="0"/>
+        <w:ind w:left="567"/>
+        <w:shd w:fill="F5F5F5" w:val="clear"/>
+      </w:pPr>
+      <w:r>
+        <w:rPr>
+          <w:rFonts w:ascii="Consolas" w:hAnsi="Consolas"/>
+          <w:color w:val="1A1A2E"/>
+          <w:sz w:val="17"/>
+        </w:rPr>
+        <w:t xml:space="preserve">  --project=$PROJECT_ID --region=$REGION \</w:t>
+      </w:r>
+    </w:p>
+    <w:p>
+      <w:pPr>
+        <w:spacing w:before="0" w:after="0"/>
+        <w:ind w:left="567"/>
+        <w:shd w:fill="F5F5F5" w:val="clear"/>
+      </w:pPr>
+      <w:r>
+        <w:rPr>
+          <w:rFonts w:ascii="Consolas" w:hAnsi="Consolas"/>
+          <w:color w:val="1A1A2E"/>
+          <w:sz w:val="17"/>
+        </w:rPr>
+        <w:t xml:space="preserve">  --member="user:developer@example.com" \</w:t>
+      </w:r>
+    </w:p>
+    <w:p>
+      <w:pPr>
+        <w:spacing w:before="0" w:after="0"/>
+        <w:ind w:left="567"/>
+        <w:shd w:fill="F5F5F5" w:val="clear"/>
+      </w:pPr>
+      <w:r>
+        <w:rPr>
+          <w:rFonts w:ascii="Consolas" w:hAnsi="Consolas"/>
+          <w:color w:val="1A1A2E"/>
+          <w:sz w:val="17"/>
+        </w:rPr>
+        <w:t xml:space="preserve">  --role="roles/run.invoker" --quiet</w:t>
+      </w:r>
+    </w:p>
+    <w:p>
+      <w:pPr>
+        <w:pStyle w:val="Heading2"/>
+      </w:pPr>
+      <w:r>
+        <w:t>12.2 Developer: Connecting to the Dev VM</w:t>
+      </w:r>
+    </w:p>
+    <w:p>
+      <w:r>
+        <w:t>Once the admin has completed onboarding, the developer connects with a single command:</w:t>
+      </w:r>
+    </w:p>
+    <w:p>
+      <w:pPr>
+        <w:spacing w:before="0" w:after="0"/>
+        <w:ind w:left="567"/>
+        <w:shd w:fill="F5F5F5" w:val="clear"/>
+      </w:pPr>
+      <w:r>
+        <w:rPr>
+          <w:rFonts w:ascii="Consolas" w:hAnsi="Consolas"/>
+          <w:color w:val="1A1A2E"/>
+          <w:sz w:val="17"/>
+        </w:rPr>
+        <w:t>gcloud compute ssh claude-code-dev-shared \</w:t>
+      </w:r>
+    </w:p>
+    <w:p>
+      <w:pPr>
+        <w:spacing w:before="0" w:after="0"/>
+        <w:ind w:left="567"/>
+        <w:shd w:fill="F5F5F5" w:val="clear"/>
+      </w:pPr>
+      <w:r>
+        <w:rPr>
+          <w:rFonts w:ascii="Consolas" w:hAnsi="Consolas"/>
+          <w:color w:val="1A1A2E"/>
+          <w:sz w:val="17"/>
+        </w:rPr>
+        <w:t xml:space="preserve">  --tunnel-through-iap \</w:t>
+      </w:r>
+    </w:p>
+    <w:p>
+      <w:pPr>
+        <w:spacing w:before="0" w:after="0"/>
+        <w:ind w:left="567"/>
+        <w:shd w:fill="F5F5F5" w:val="clear"/>
+      </w:pPr>
+      <w:r>
+        <w:rPr>
+          <w:rFonts w:ascii="Consolas" w:hAnsi="Consolas"/>
+          <w:color w:val="1A1A2E"/>
+          <w:sz w:val="17"/>
+        </w:rPr>
+        <w:t xml:space="preserve">  --project=$PROJECT_ID \</w:t>
+      </w:r>
+    </w:p>
+    <w:p>
+      <w:pPr>
+        <w:spacing w:before="0" w:after="0"/>
+        <w:ind w:left="567"/>
+        <w:shd w:fill="F5F5F5" w:val="clear"/>
+      </w:pPr>
+      <w:r>
+        <w:rPr>
+          <w:rFonts w:ascii="Consolas" w:hAnsi="Consolas"/>
+          <w:color w:val="1A1A2E"/>
+          <w:sz w:val="17"/>
+        </w:rPr>
+        <w:t xml:space="preserve">  --zone=$ZONE</w:t>
+      </w:r>
+    </w:p>
+    <w:p/>
+    <w:p>
+      <w:r>
+        <w:t>On first connection, gcloud generates an SSH key pair and pushes it via OS Login. This takes 10-20 seconds. Subsequent connections are instant.</w:t>
+      </w:r>
+    </w:p>
+    <w:p>
+      <w:r>
+        <w:t>Once on the VM, the developer simply runs claude — the CLI is pre-installed and settings.json is pre-configured with the gateway URLs and project settings. No additional setup is required.</w:t>
+      </w:r>
+    </w:p>
+    <w:p>
+      <w:pPr>
+        <w:pStyle w:val="Heading2"/>
+      </w:pPr>
+      <w:r>
+        <w:t>12.3 What the Dev VM Provides</w:t>
+      </w:r>
+    </w:p>
+    <w:tbl>
+      <w:tblPr>
+        <w:tblStyle w:val="TableGrid"/>
+        <w:tblW w:type="auto" w:w="0"/>
+        <w:jc w:val="left"/>
+        <w:tblLook w:firstColumn="1" w:firstRow="1" w:lastColumn="0" w:lastRow="0" w:noHBand="0" w:noVBand="1" w:val="04A0"/>
+      </w:tblPr>
+      <w:tblGrid>
+        <w:gridCol w:w="4320"/>
+        <w:gridCol w:w="4320"/>
+      </w:tblGrid>
+      <w:tr>
+        <w:tc>
+          <w:tcPr>
+            <w:tcW w:type="dxa" w:w="4320"/>
+            <w:shd w:fill="1a73e8" w:val="clear"/>
+          </w:tcPr>
+          <w:p>
+            <w:pPr>
+              <w:jc w:val="left"/>
+            </w:pPr>
+            <w:r/>
+            <w:r>
+              <w:rPr>
+                <w:b/>
+                <w:color w:val="FFFFFF"/>
+                <w:sz w:val="18"/>
+              </w:rPr>
+              <w:t>Component</w:t>
+            </w:r>
+          </w:p>
+        </w:tc>
+        <w:tc>
+          <w:tcPr>
+            <w:tcW w:type="dxa" w:w="4320"/>
+            <w:shd w:fill="1a73e8" w:val="clear"/>
+          </w:tcPr>
+          <w:p>
+            <w:pPr>
+              <w:jc w:val="left"/>
+            </w:pPr>
+            <w:r/>
+            <w:r>
+              <w:rPr>
+                <w:b/>
+                <w:color w:val="FFFFFF"/>
+                <w:sz w:val="18"/>
+              </w:rPr>
+              <w:t>Details</w:t>
+            </w:r>
+          </w:p>
+        </w:tc>
+      </w:tr>
+      <w:tr>
+        <w:tc>
+          <w:tcPr>
+            <w:tcW w:type="dxa" w:w="4320"/>
+          </w:tcPr>
+          <w:p>
+            <w:r/>
+            <w:r>
+              <w:rPr>
+                <w:sz w:val="18"/>
+              </w:rPr>
+              <w:t>Claude Code CLI</w:t>
+            </w:r>
+          </w:p>
+        </w:tc>
+        <w:tc>
+          <w:tcPr>
+            <w:tcW w:type="dxa" w:w="4320"/>
+          </w:tcPr>
+          <w:p>
+            <w:r/>
+            <w:r>
+              <w:rPr>
+                <w:sz w:val="18"/>
+              </w:rPr>
+              <w:t>Pre-installed via npm at startup</w:t>
+            </w:r>
+          </w:p>
+        </w:tc>
+      </w:tr>
+      <w:tr>
+        <w:tc>
+          <w:tcPr>
+            <w:tcW w:type="dxa" w:w="4320"/>
+            <w:shd w:fill="f0f4ff" w:val="clear"/>
+          </w:tcPr>
+          <w:p>
+            <w:r/>
+            <w:r>
+              <w:rPr>
+                <w:sz w:val="18"/>
+              </w:rPr>
+              <w:t>settings.json</w:t>
+            </w:r>
+          </w:p>
+        </w:tc>
+        <w:tc>
+          <w:tcPr>
+            <w:tcW w:type="dxa" w:w="4320"/>
+            <w:shd w:fill="f0f4ff" w:val="clear"/>
+          </w:tcPr>
+          <w:p>
+            <w:r/>
+            <w:r>
+              <w:rPr>
+                <w:sz w:val="18"/>
+              </w:rPr>
+              <w:t>Pre-configured with gateway URLs, project ID, region, model pins</w:t>
+            </w:r>
+          </w:p>
+        </w:tc>
+      </w:tr>
+      <w:tr>
+        <w:tc>
+          <w:tcPr>
+            <w:tcW w:type="dxa" w:w="4320"/>
+          </w:tcPr>
+          <w:p>
+            <w:r/>
+            <w:r>
+              <w:rPr>
+                <w:sz w:val="18"/>
+              </w:rPr>
+              <w:t>ADC credentials</w:t>
+            </w:r>
+          </w:p>
+        </w:tc>
+        <w:tc>
+          <w:tcPr>
+            <w:tcW w:type="dxa" w:w="4320"/>
+          </w:tcPr>
+          <w:p>
+            <w:r/>
+            <w:r>
+              <w:rPr>
+                <w:sz w:val="18"/>
+              </w:rPr>
+              <w:t>VM service account, auto-rotated by GCE metadata server</w:t>
+            </w:r>
+          </w:p>
+        </w:tc>
+      </w:tr>
+      <w:tr>
+        <w:tc>
+          <w:tcPr>
+            <w:tcW w:type="dxa" w:w="4320"/>
+            <w:shd w:fill="f0f4ff" w:val="clear"/>
+          </w:tcPr>
+          <w:p>
+            <w:r/>
+            <w:r>
+              <w:rPr>
+                <w:sz w:val="18"/>
+              </w:rPr>
+              <w:t>VS Code Server</w:t>
+            </w:r>
+          </w:p>
+        </w:tc>
+        <w:tc>
+          <w:tcPr>
+            <w:tcW w:type="dxa" w:w="4320"/>
+            <w:shd w:fill="f0f4ff" w:val="clear"/>
+          </w:tcPr>
+          <w:p>
+            <w:r/>
+            <w:r>
+              <w:rPr>
+                <w:sz w:val="18"/>
+              </w:rPr>
+              <w:t>Browser-based IDE (optional, controlled by install_vscode_server)</w:t>
+            </w:r>
+          </w:p>
+        </w:tc>
+      </w:tr>
+      <w:tr>
+        <w:tc>
+          <w:tcPr>
+            <w:tcW w:type="dxa" w:w="4320"/>
+          </w:tcPr>
+          <w:p>
+            <w:r/>
+            <w:r>
+              <w:rPr>
+                <w:sz w:val="18"/>
+              </w:rPr>
+              <w:t>Auto-shutdown</w:t>
+            </w:r>
+          </w:p>
+        </w:tc>
+        <w:tc>
+          <w:tcPr>
+            <w:tcW w:type="dxa" w:w="4320"/>
+          </w:tcPr>
+          <w:p>
+            <w:r/>
+            <w:r>
+              <w:rPr>
+                <w:sz w:val="18"/>
+              </w:rPr>
+              <w:t>Shuts down after N hours idle (default: 2) to save costs</w:t>
+            </w:r>
+          </w:p>
+        </w:tc>
+      </w:tr>
+    </w:tbl>
+    <w:p>
+      <w:r>
+        <w:br w:type="page"/>
+      </w:r>
+    </w:p>
+    <w:p>
+      <w:pPr>
+        <w:pStyle w:val="Heading1"/>
+      </w:pPr>
+      <w:r>
+        <w:t>13. Validation and Regression Testing</w:t>
+      </w:r>
+    </w:p>
+    <w:p>
+      <w:pPr>
+        <w:pStyle w:val="Heading2"/>
+      </w:pPr>
+      <w:r>
+        <w:t>13.1 Pre-Deploy Checks: pre-deploy-check.sh</w:t>
       </w:r>
     </w:p>
     <w:p>
@@ -8753,7 +9527,7 @@
         <w:pStyle w:val="Heading2"/>
       </w:pPr>
       <w:r>
-        <w:t>12.2 End-to-End Tests: e2e-test.sh</w:t>
+        <w:t>13.2 End-to-End Tests: e2e-test.sh</w:t>
       </w:r>
     </w:p>
     <w:p>
@@ -9361,7 +10135,7 @@
           <w:color w:val="333333"/>
           <w:sz w:val="18"/>
         </w:rPr>
-        <w:t xml:space="preserve">  |     |-- Grant roles/aiplatform.user + roles/logging.logWriter</w:t>
+        <w:t xml:space="preserve">  |     |-- Grant roles/aiplatform.user + logging.logWriter + iam.serviceAccountViewer</w:t>
       </w:r>
     </w:p>
     <w:p>
@@ -9436,7 +10210,7 @@
           <w:color w:val="333333"/>
           <w:sz w:val="18"/>
         </w:rPr>
-        <w:t xml:space="preserve">  |-- deploy-mcp-gateway.sh  (same shape, same three-way ingress)</w:t>
+        <w:t xml:space="preserve">  |-- deploy-mcp-gateway.sh  (same shape, + iam.serviceAccountViewer)</w:t>
       </w:r>
     </w:p>
     <w:p>
@@ -9589,6 +10363,51 @@
         <w:t xml:space="preserve">  +-- (optional) deploy-dev-vm.sh (recommended for VPC-internal; always last)</w:t>
       </w:r>
     </w:p>
+    <w:p>
+      <w:pPr>
+        <w:spacing w:before="0" w:after="0"/>
+        <w:ind w:left="850"/>
+        <w:jc w:val="left"/>
+      </w:pPr>
+      <w:r>
+        <w:rPr>
+          <w:rFonts w:ascii="Consolas" w:hAnsi="Consolas"/>
+          <w:color w:val="333333"/>
+          <w:sz w:val="18"/>
+        </w:rPr>
+        <w:t xml:space="preserve">        |-- Enable Private Google Access on subnet</w:t>
+      </w:r>
+    </w:p>
+    <w:p>
+      <w:pPr>
+        <w:spacing w:before="0" w:after="0"/>
+        <w:ind w:left="850"/>
+        <w:jc w:val="left"/>
+      </w:pPr>
+      <w:r>
+        <w:rPr>
+          <w:rFonts w:ascii="Consolas" w:hAnsi="Consolas"/>
+          <w:color w:val="333333"/>
+          <w:sz w:val="18"/>
+        </w:rPr>
+        <w:t xml:space="preserve">        |-- Grant VM SA roles/run.invoker on dashboard</w:t>
+      </w:r>
+    </w:p>
+    <w:p>
+      <w:pPr>
+        <w:spacing w:before="0" w:after="0"/>
+        <w:ind w:left="850"/>
+        <w:jc w:val="left"/>
+      </w:pPr>
+      <w:r>
+        <w:rPr>
+          <w:rFonts w:ascii="Consolas" w:hAnsi="Consolas"/>
+          <w:color w:val="333333"/>
+          <w:sz w:val="18"/>
+        </w:rPr>
+        <w:t xml:space="preserve">        +-- Create GCE VM (no public IP, IAP SSH, OS Login)</w:t>
+      </w:r>
+    </w:p>
     <w:p/>
     <w:p>
       <w:pPr>
@@ -9949,7 +10768,37 @@
           <w:color w:val="333333"/>
           <w:sz w:val="18"/>
         </w:rPr>
-        <w:t xml:space="preserve">  |-- --&gt; token_validation.py validates token, checks ALLOWED_PRINCIPALS</w:t>
+        <w:t xml:space="preserve">  |-- --&gt; token_validation.py classifies token (ya29.* = access, else JWT)</w:t>
+      </w:r>
+    </w:p>
+    <w:p>
+      <w:pPr>
+        <w:spacing w:before="0" w:after="0"/>
+        <w:ind w:left="850"/>
+        <w:jc w:val="left"/>
+      </w:pPr>
+      <w:r>
+        <w:rPr>
+          <w:rFonts w:ascii="Consolas" w:hAnsi="Consolas"/>
+          <w:color w:val="333333"/>
+          <w:sz w:val="18"/>
+        </w:rPr>
+        <w:t xml:space="preserve">  |       validates token, resolves email (IAM API fallback for GCE tokens)</w:t>
+      </w:r>
+    </w:p>
+    <w:p>
+      <w:pPr>
+        <w:spacing w:before="0" w:after="0"/>
+        <w:ind w:left="850"/>
+        <w:jc w:val="left"/>
+      </w:pPr>
+      <w:r>
+        <w:rPr>
+          <w:rFonts w:ascii="Consolas" w:hAnsi="Consolas"/>
+          <w:color w:val="333333"/>
+          <w:sz w:val="18"/>
+        </w:rPr>
+        <w:t xml:space="preserve">  |       checks ALLOWED_PRINCIPALS</w:t>
       </w:r>
     </w:p>
     <w:p>

</xml_diff>